<commit_message>
feat: add DeepSeek Info Bot support and real Android demo video
- Info Bot can use DeepSeek directly; Settings syncs the DeepSeek key

- recorded the actual APK in a Pixel 5 Android emulator

- demo covers generator, history, exploits and a real DeepSeek reply

- added reproducible browser/Android recording scripts and demo docs
</commit_message>
<xml_diff>
--- a/docs/docx/PANDUAN-DEMO-VIDEO.docx
+++ b/docs/docx/PANDUAN-DEMO-VIDEO.docx
@@ -14,6 +14,58 @@
           <w:sz w:val="40"/>
         </w:rPr>
         <w:t>Panduan Demo Video — PayloadHub-AI</w:t>
+      </w:r>
+    </w:p>
+    <w:p>
+      <w:pPr>
+        <w:spacing w:before="60" w:after="60"/>
+        <w:ind w:left="360"/>
+      </w:pPr>
+      <w:r>
+        <w:rPr>
+          <w:b/>
+          <w:i/>
+          <w:color w:val="444444"/>
+        </w:rPr>
+        <w:t>Video jadi:</w:t>
+      </w:r>
+      <w:r>
+        <w:rPr>
+          <w:b w:val="0"/>
+          <w:i/>
+          <w:color w:val="444444"/>
+        </w:rPr>
+        <w:t xml:space="preserve"> </w:t>
+      </w:r>
+      <w:r>
+        <w:rPr>
+          <w:i/>
+          <w:color w:val="444444"/>
+          <w:u w:val="single"/>
+        </w:rPr>
+        <w:t>`demo/PayloadHub-AI-Demo-Android.mp4`</w:t>
+      </w:r>
+      <w:r>
+        <w:rPr>
+          <w:i/>
+          <w:color w:val="444444"/>
+          <w:sz w:val="17"/>
+        </w:rPr>
+        <w:t xml:space="preserve"> (demo/PayloadHub-AI-Demo-Android.mp4)</w:t>
+      </w:r>
+    </w:p>
+    <w:p>
+      <w:pPr>
+        <w:spacing w:before="60" w:after="60"/>
+        <w:ind w:left="360"/>
+      </w:pPr>
+      <w:r>
+        <w:rPr>
+          <w:b w:val="0"/>
+          <w:i/>
+          <w:color w:val="444444"/>
+        </w:rPr>
+        <w:t>— rekaman APK asli di emulator Android, 1 menit 44 detik.</w:t>
       </w:r>
     </w:p>
     <w:p>

</xml_diff>